<commit_message>
docs(fabrica): mover card de coluna pela CLI com --field/--value
Co-Authored-By: Claude Opus 5.5 <noreply@anthropic.com>
</commit_message>
<xml_diff>
--- a/docs/FABRICA_DE_SOFTWARE.docx
+++ b/docs/FABRICA_DE_SOFTWARE.docx
@@ -5492,13 +5492,140 @@
         </w:rPr>
         <w:t xml:space="preserve">&gt;</w:t>
       </w:r>
-    </w:p>
-    <w:p>
-      <w:pPr>
-        <w:pStyle w:val="FirstParagraph"/>
-      </w:pPr>
-      <w:r>
-        <w:t xml:space="preserve">(Mudar a coluna pela CLI exige IDs internos do board; pela tela é só arrastar.)</w:t>
+      <w:r>
+        <w:br/>
+      </w:r>
+      <w:r>
+        <w:rPr>
+          <w:rStyle w:val="ExtensionTok"/>
+        </w:rPr>
+        <w:t xml:space="preserve">gh</w:t>
+      </w:r>
+      <w:r>
+        <w:rPr>
+          <w:rStyle w:val="NormalTok"/>
+        </w:rPr>
+        <w:t xml:space="preserve"> project item-edit 1 </w:t>
+      </w:r>
+      <w:r>
+        <w:rPr>
+          <w:rStyle w:val="AttributeTok"/>
+        </w:rPr>
+        <w:t xml:space="preserve">--owner</w:t>
+      </w:r>
+      <w:r>
+        <w:rPr>
+          <w:rStyle w:val="NormalTok"/>
+        </w:rPr>
+        <w:t xml:space="preserve"> ScaTecnologia-Lab2 </w:t>
+      </w:r>
+      <w:r>
+        <w:rPr>
+          <w:rStyle w:val="DataTypeTok"/>
+        </w:rPr>
+        <w:t xml:space="preserve">\</w:t>
+      </w:r>
+      <w:r>
+        <w:br/>
+      </w:r>
+      <w:r>
+        <w:rPr>
+          <w:rStyle w:val="NormalTok"/>
+        </w:rPr>
+        <w:t xml:space="preserve">  </w:t>
+      </w:r>
+      <w:r>
+        <w:rPr>
+          <w:rStyle w:val="AttributeTok"/>
+        </w:rPr>
+        <w:t xml:space="preserve">--url</w:t>
+      </w:r>
+      <w:r>
+        <w:rPr>
+          <w:rStyle w:val="NormalTok"/>
+        </w:rPr>
+        <w:t xml:space="preserve"> https://github.com/ScaTecnologia-Lab2/laboratorio-claude-code/issues/</w:t>
+      </w:r>
+      <w:r>
+        <w:rPr>
+          <w:rStyle w:val="OperatorTok"/>
+        </w:rPr>
+        <w:t xml:space="preserve">&lt;</w:t>
+      </w:r>
+      <w:r>
+        <w:rPr>
+          <w:rStyle w:val="NormalTok"/>
+        </w:rPr>
+        <w:t xml:space="preserve">número</w:t>
+      </w:r>
+      <w:r>
+        <w:rPr>
+          <w:rStyle w:val="OperatorTok"/>
+        </w:rPr>
+        <w:t xml:space="preserve">&gt;</w:t>
+      </w:r>
+      <w:r>
+        <w:rPr>
+          <w:rStyle w:val="NormalTok"/>
+        </w:rPr>
+        <w:t xml:space="preserve"> </w:t>
+      </w:r>
+      <w:r>
+        <w:rPr>
+          <w:rStyle w:val="DataTypeTok"/>
+        </w:rPr>
+        <w:t xml:space="preserve">\</w:t>
+      </w:r>
+      <w:r>
+        <w:br/>
+      </w:r>
+      <w:r>
+        <w:rPr>
+          <w:rStyle w:val="NormalTok"/>
+        </w:rPr>
+        <w:t xml:space="preserve">  </w:t>
+      </w:r>
+      <w:r>
+        <w:rPr>
+          <w:rStyle w:val="AttributeTok"/>
+        </w:rPr>
+        <w:t xml:space="preserve">--field</w:t>
+      </w:r>
+      <w:r>
+        <w:rPr>
+          <w:rStyle w:val="NormalTok"/>
+        </w:rPr>
+        <w:t xml:space="preserve"> Status </w:t>
+      </w:r>
+      <w:r>
+        <w:rPr>
+          <w:rStyle w:val="AttributeTok"/>
+        </w:rPr>
+        <w:t xml:space="preserve">--value</w:t>
+      </w:r>
+      <w:r>
+        <w:rPr>
+          <w:rStyle w:val="NormalTok"/>
+        </w:rPr>
+        <w:t xml:space="preserve"> </w:t>
+      </w:r>
+      <w:r>
+        <w:rPr>
+          <w:rStyle w:val="StringTok"/>
+        </w:rPr>
+        <w:t xml:space="preserve">"To Do"</w:t>
+      </w:r>
+      <w:r>
+        <w:rPr>
+          <w:rStyle w:val="NormalTok"/>
+        </w:rPr>
+        <w:t xml:space="preserve">          </w:t>
+      </w:r>
+      <w:r>
+        <w:rPr>
+          <w:rStyle w:val="CommentTok"/>
+        </w:rPr>
+        <w:t xml:space="preserve"># move o card de coluna (Backlog, To Do, Em Progresso, Em Revisão, Concluído)</w:t>
       </w:r>
     </w:p>
     <w:p>
@@ -5808,6 +5935,105 @@
           <w:rStyle w:val="CommentTok"/>
         </w:rPr>
         <w:t xml:space="preserve"># lê o card no terminal</w:t>
+      </w:r>
+      <w:r>
+        <w:br/>
+      </w:r>
+      <w:r>
+        <w:rPr>
+          <w:rStyle w:val="ExtensionTok"/>
+        </w:rPr>
+        <w:t xml:space="preserve">gh</w:t>
+      </w:r>
+      <w:r>
+        <w:rPr>
+          <w:rStyle w:val="NormalTok"/>
+        </w:rPr>
+        <w:t xml:space="preserve"> project item-edit 1 </w:t>
+      </w:r>
+      <w:r>
+        <w:rPr>
+          <w:rStyle w:val="AttributeTok"/>
+        </w:rPr>
+        <w:t xml:space="preserve">--owner</w:t>
+      </w:r>
+      <w:r>
+        <w:rPr>
+          <w:rStyle w:val="NormalTok"/>
+        </w:rPr>
+        <w:t xml:space="preserve"> ScaTecnologia-Lab2 </w:t>
+      </w:r>
+      <w:r>
+        <w:rPr>
+          <w:rStyle w:val="DataTypeTok"/>
+        </w:rPr>
+        <w:t xml:space="preserve">\</w:t>
+      </w:r>
+      <w:r>
+        <w:br/>
+      </w:r>
+      <w:r>
+        <w:rPr>
+          <w:rStyle w:val="NormalTok"/>
+        </w:rPr>
+        <w:t xml:space="preserve">  </w:t>
+      </w:r>
+      <w:r>
+        <w:rPr>
+          <w:rStyle w:val="AttributeTok"/>
+        </w:rPr>
+        <w:t xml:space="preserve">--url</w:t>
+      </w:r>
+      <w:r>
+        <w:rPr>
+          <w:rStyle w:val="NormalTok"/>
+        </w:rPr>
+        <w:t xml:space="preserve"> https://github.com/ScaTecnologia-Lab2/laboratorio-claude-code/issues/37 </w:t>
+      </w:r>
+      <w:r>
+        <w:rPr>
+          <w:rStyle w:val="DataTypeTok"/>
+        </w:rPr>
+        <w:t xml:space="preserve">\</w:t>
+      </w:r>
+      <w:r>
+        <w:br/>
+      </w:r>
+      <w:r>
+        <w:rPr>
+          <w:rStyle w:val="NormalTok"/>
+        </w:rPr>
+        <w:t xml:space="preserve">  </w:t>
+      </w:r>
+      <w:r>
+        <w:rPr>
+          <w:rStyle w:val="AttributeTok"/>
+        </w:rPr>
+        <w:t xml:space="preserve">--field</w:t>
+      </w:r>
+      <w:r>
+        <w:rPr>
+          <w:rStyle w:val="NormalTok"/>
+        </w:rPr>
+        <w:t xml:space="preserve"> Status </w:t>
+      </w:r>
+      <w:r>
+        <w:rPr>
+          <w:rStyle w:val="AttributeTok"/>
+        </w:rPr>
+        <w:t xml:space="preserve">--value</w:t>
+      </w:r>
+      <w:r>
+        <w:rPr>
+          <w:rStyle w:val="NormalTok"/>
+        </w:rPr>
+        <w:t xml:space="preserve"> </w:t>
+      </w:r>
+      <w:r>
+        <w:rPr>
+          <w:rStyle w:val="StringTok"/>
+        </w:rPr>
+        <w:t xml:space="preserve">"Em Progresso"</w:t>
       </w:r>
     </w:p>
     <w:bookmarkEnd w:id="37"/>

</xml_diff>